<commit_message>
maj style rapport IA
</commit_message>
<xml_diff>
--- a/rendu/ia/Rapport_IA_Saidou_COUMARE.docx
+++ b/rendu/ia/Rapport_IA_Saidou_COUMARE.docx
@@ -2,77 +2,113 @@
 <file path=word/document.xml><?xml version="1.0" encoding="utf-8"?>
 <w:document xmlns:wpc="http://schemas.microsoft.com/office/word/2010/wordprocessingCanvas" xmlns:mo="http://schemas.microsoft.com/office/mac/office/2008/main" xmlns:mc="http://schemas.openxmlformats.org/markup-compatibility/2006" xmlns:mv="urn:schemas-microsoft-com:mac:vml" xmlns:o="urn:schemas-microsoft-com:office:office" xmlns:r="http://schemas.openxmlformats.org/officeDocument/2006/relationships" xmlns:m="http://schemas.openxmlformats.org/officeDocument/2006/math" xmlns:v="urn:schemas-microsoft-com:vml" xmlns:wp14="http://schemas.microsoft.com/office/word/2010/wordprocessingDrawing" xmlns:wp="http://schemas.openxmlformats.org/drawingml/2006/wordprocessingDrawing" xmlns:w10="urn:schemas-microsoft-com:office:word" xmlns:w="http://schemas.openxmlformats.org/wordprocessingml/2006/main" xmlns:w14="http://schemas.microsoft.com/office/word/2010/wordml" xmlns:wpg="http://schemas.microsoft.com/office/word/2010/wordprocessingGroup" xmlns:wpi="http://schemas.microsoft.com/office/word/2010/wordprocessingInk" xmlns:wne="http://schemas.microsoft.com/office/word/2006/wordml" xmlns:wps="http://schemas.microsoft.com/office/word/2010/wordprocessingShape" mc:Ignorable="w14 wp14">
   <w:body>
+    <w:tbl>
+      <w:tblPr>
+        <w:tblW w:type="auto" w:w="0"/>
+        <w:tblLook w:firstColumn="1" w:firstRow="1" w:lastColumn="0" w:lastRow="0" w:noHBand="0" w:noVBand="1" w:val="04A0"/>
+      </w:tblPr>
+      <w:tblGrid>
+        <w:gridCol w:w="9406"/>
+      </w:tblGrid>
+      <w:tr>
+        <w:tc>
+          <w:tcPr>
+            <w:tcW w:type="dxa" w:w="9406"/>
+            <w:shd w:val="clear" w:color="auto" w:fill="1B5E20"/>
+          </w:tcPr>
+          <w:p>
+            <w:pPr>
+              <w:spacing w:before="280" w:after="280"/>
+            </w:pPr>
+            <w:r>
+              <w:rPr>
+                <w:b/>
+                <w:color w:val="FFFFFF"/>
+                <w:sz w:val="22"/>
+              </w:rPr>
+              <w:t xml:space="preserve">  TechCorp Industries — Hackathon IA 2026</w:t>
+            </w:r>
+          </w:p>
+        </w:tc>
+      </w:tr>
+    </w:tbl>
     <w:p/>
     <w:p/>
     <w:p/>
     <w:p>
       <w:pPr>
-        <w:jc w:val="center"/>
+        <w:jc w:val="left"/>
       </w:pPr>
       <w:r>
         <w:rPr>
           <w:b/>
-          <w:color w:val="1F497D"/>
-          <w:sz w:val="52"/>
+          <w:color w:val="1B5E20"/>
+          <w:sz w:val="56"/>
         </w:rPr>
         <w:t>RAPPORT IA</w:t>
       </w:r>
     </w:p>
     <w:p>
+      <w:r>
+        <w:rPr>
+          <w:color w:val="E65C00"/>
+          <w:sz w:val="24"/>
+        </w:rPr>
+        <w:t>━━━━━━━━━━━━━━━━━━━━━━━━━━━━━━━━━━━━━━</w:t>
+      </w:r>
+    </w:p>
+    <w:p/>
+    <w:p>
       <w:pPr>
-        <w:jc w:val="center"/>
+        <w:jc w:val="left"/>
       </w:pPr>
       <w:r>
         <w:rPr>
-          <w:color w:val="2E74B5"/>
-          <w:sz w:val="28"/>
+          <w:i/>
+          <w:color w:val="212121"/>
+          <w:sz w:val="26"/>
         </w:rPr>
         <w:t>Validation du modèle Phi-3.5-Financial &amp; Fine-tuning médical expérimental</w:t>
       </w:r>
     </w:p>
     <w:p/>
+    <w:p/>
+    <w:p/>
     <w:p>
       <w:pPr>
-        <w:jc w:val="center"/>
+        <w:jc w:val="left"/>
       </w:pPr>
       <w:r>
         <w:rPr>
-          <w:color w:val="404040"/>
+          <w:b/>
+          <w:color w:val="E65C00"/>
           <w:sz w:val="22"/>
         </w:rPr>
-        <w:t>TechCorp Industries</w:t>
+        <w:t xml:space="preserve">Auteur : </w:t>
+      </w:r>
+      <w:r>
+        <w:rPr>
+          <w:color w:val="212121"/>
+          <w:sz w:val="22"/>
+        </w:rPr>
+        <w:t>Saidou COUMARE</w:t>
       </w:r>
     </w:p>
     <w:p>
       <w:pPr>
-        <w:jc w:val="center"/>
+        <w:jc w:val="left"/>
       </w:pPr>
       <w:r>
         <w:rPr>
-          <w:color w:val="404040"/>
+          <w:b/>
+          <w:color w:val="E65C00"/>
           <w:sz w:val="22"/>
         </w:rPr>
-        <w:t>Dépôt : github.com/lucille452/hackathon_ynov</w:t>
+        <w:t xml:space="preserve">Rôle : </w:t>
       </w:r>
-    </w:p>
-    <w:p>
-      <w:pPr>
-        <w:jc w:val="center"/>
-      </w:pPr>
       <w:r>
         <w:rPr>
-          <w:color w:val="404040"/>
-          <w:sz w:val="22"/>
-        </w:rPr>
-      </w:r>
-    </w:p>
-    <w:p>
-      <w:pPr>
-        <w:jc w:val="center"/>
-      </w:pPr>
-      <w:r>
-        <w:rPr>
-          <w:color w:val="404040"/>
+          <w:color w:val="212121"/>
           <w:sz w:val="22"/>
         </w:rPr>
         <w:t>Rôle : IA  |  Version 1.0</w:t>
@@ -80,11 +116,19 @@
     </w:p>
     <w:p>
       <w:pPr>
-        <w:jc w:val="center"/>
+        <w:jc w:val="left"/>
       </w:pPr>
       <w:r>
         <w:rPr>
-          <w:color w:val="404040"/>
+          <w:b/>
+          <w:color w:val="E65C00"/>
+          <w:sz w:val="22"/>
+        </w:rPr>
+        <w:t xml:space="preserve">Date : </w:t>
+      </w:r>
+      <w:r>
+        <w:rPr>
+          <w:color w:val="212121"/>
           <w:sz w:val="22"/>
         </w:rPr>
         <w:t>Juillet 2026</w:t>
@@ -92,14 +136,22 @@
     </w:p>
     <w:p>
       <w:pPr>
-        <w:jc w:val="center"/>
+        <w:jc w:val="left"/>
       </w:pPr>
       <w:r>
         <w:rPr>
-          <w:color w:val="404040"/>
+          <w:b/>
+          <w:color w:val="E65C00"/>
           <w:sz w:val="22"/>
         </w:rPr>
-        <w:t>Saidou COUMARE</w:t>
+        <w:t xml:space="preserve">Dépôt : </w:t>
+      </w:r>
+      <w:r>
+        <w:rPr>
+          <w:color w:val="212121"/>
+          <w:sz w:val="22"/>
+        </w:rPr>
+        <w:t>github.com/lucille452/hackathon_ynov</w:t>
       </w:r>
     </w:p>
     <w:p>
@@ -109,14 +161,27 @@
     </w:p>
     <w:p>
       <w:pPr>
-        <w:pStyle w:val="Heading1"/>
+        <w:spacing w:before="320" w:after="40"/>
       </w:pPr>
       <w:r>
         <w:rPr>
-          <w:color w:val="1F497D"/>
+          <w:b/>
+          <w:color w:val="1B5E20"/>
           <w:sz w:val="28"/>
         </w:rPr>
         <w:t>1. Contexte et objectifs</w:t>
+      </w:r>
+    </w:p>
+    <w:p>
+      <w:pPr>
+        <w:spacing w:after="120"/>
+      </w:pPr>
+      <w:r>
+        <w:rPr>
+          <w:color w:val="E65C00"/>
+          <w:sz w:val="18"/>
+        </w:rPr>
+        <w:t>────────────────────────────────────────────────────────────</w:t>
       </w:r>
     </w:p>
     <w:p>
@@ -129,21 +194,34 @@
     </w:p>
     <w:p>
       <w:pPr>
-        <w:pStyle w:val="Heading1"/>
+        <w:spacing w:before="320" w:after="40"/>
       </w:pPr>
       <w:r>
         <w:rPr>
-          <w:color w:val="1F497D"/>
+          <w:b/>
+          <w:color w:val="1B5E20"/>
           <w:sz w:val="28"/>
         </w:rPr>
         <w:t>2. Modèle Phi-3.5-Financial — description</w:t>
+      </w:r>
+    </w:p>
+    <w:p>
+      <w:pPr>
+        <w:spacing w:after="120"/>
+      </w:pPr>
+      <w:r>
+        <w:rPr>
+          <w:color w:val="E65C00"/>
+          <w:sz w:val="18"/>
+        </w:rPr>
+        <w:t>────────────────────────────────────────────────────────────</w:t>
       </w:r>
     </w:p>
     <w:tbl>
       <w:tblPr>
         <w:tblStyle w:val="TableGrid"/>
         <w:tblW w:type="auto" w:w="0"/>
-        <w:jc w:val="center"/>
+        <w:jc w:val="left"/>
         <w:tblLook w:firstColumn="1" w:firstRow="1" w:lastColumn="0" w:lastRow="0" w:noHBand="0" w:noVBand="1" w:val="04A0"/>
       </w:tblPr>
       <w:tblGrid>
@@ -154,7 +232,7 @@
         <w:tc>
           <w:tcPr>
             <w:tcW w:type="dxa" w:w="4703"/>
-            <w:shd w:val="clear" w:color="auto" w:fill="1F497D"/>
+            <w:shd w:val="clear" w:color="auto" w:fill="1B5E20"/>
           </w:tcPr>
           <w:p>
             <w:r>
@@ -170,7 +248,7 @@
         <w:tc>
           <w:tcPr>
             <w:tcW w:type="dxa" w:w="4703"/>
-            <w:shd w:val="clear" w:color="auto" w:fill="1F497D"/>
+            <w:shd w:val="clear" w:color="auto" w:fill="1B5E20"/>
           </w:tcPr>
           <w:p>
             <w:r>
@@ -188,7 +266,7 @@
         <w:tc>
           <w:tcPr>
             <w:tcW w:type="dxa" w:w="4703"/>
-            <w:shd w:val="clear" w:color="auto" w:fill="DEEAF1"/>
+            <w:shd w:val="clear" w:color="auto" w:fill="E8F5E9"/>
           </w:tcPr>
           <w:p>
             <w:r>
@@ -202,7 +280,7 @@
         <w:tc>
           <w:tcPr>
             <w:tcW w:type="dxa" w:w="4703"/>
-            <w:shd w:val="clear" w:color="auto" w:fill="DEEAF1"/>
+            <w:shd w:val="clear" w:color="auto" w:fill="E8F5E9"/>
           </w:tcPr>
           <w:p>
             <w:r>
@@ -248,7 +326,7 @@
         <w:tc>
           <w:tcPr>
             <w:tcW w:type="dxa" w:w="4703"/>
-            <w:shd w:val="clear" w:color="auto" w:fill="DEEAF1"/>
+            <w:shd w:val="clear" w:color="auto" w:fill="E8F5E9"/>
           </w:tcPr>
           <w:p>
             <w:r>
@@ -262,7 +340,7 @@
         <w:tc>
           <w:tcPr>
             <w:tcW w:type="dxa" w:w="4703"/>
-            <w:shd w:val="clear" w:color="auto" w:fill="DEEAF1"/>
+            <w:shd w:val="clear" w:color="auto" w:fill="E8F5E9"/>
           </w:tcPr>
           <w:p>
             <w:r>
@@ -308,7 +386,7 @@
         <w:tc>
           <w:tcPr>
             <w:tcW w:type="dxa" w:w="4703"/>
-            <w:shd w:val="clear" w:color="auto" w:fill="DEEAF1"/>
+            <w:shd w:val="clear" w:color="auto" w:fill="E8F5E9"/>
           </w:tcPr>
           <w:p>
             <w:r>
@@ -322,7 +400,7 @@
         <w:tc>
           <w:tcPr>
             <w:tcW w:type="dxa" w:w="4703"/>
-            <w:shd w:val="clear" w:color="auto" w:fill="DEEAF1"/>
+            <w:shd w:val="clear" w:color="auto" w:fill="E8F5E9"/>
           </w:tcPr>
           <w:p>
             <w:r>
@@ -368,7 +446,7 @@
         <w:tc>
           <w:tcPr>
             <w:tcW w:type="dxa" w:w="4703"/>
-            <w:shd w:val="clear" w:color="auto" w:fill="DEEAF1"/>
+            <w:shd w:val="clear" w:color="auto" w:fill="E8F5E9"/>
           </w:tcPr>
           <w:p>
             <w:r>
@@ -382,7 +460,7 @@
         <w:tc>
           <w:tcPr>
             <w:tcW w:type="dxa" w:w="4703"/>
-            <w:shd w:val="clear" w:color="auto" w:fill="DEEAF1"/>
+            <w:shd w:val="clear" w:color="auto" w:fill="E8F5E9"/>
           </w:tcPr>
           <w:p>
             <w:r>
@@ -436,11 +514,12 @@
     <w:p/>
     <w:p>
       <w:pPr>
-        <w:pStyle w:val="Heading1"/>
+        <w:spacing w:before="320" w:after="40"/>
       </w:pPr>
       <w:r>
         <w:rPr>
-          <w:color w:val="1F497D"/>
+          <w:b/>
+          <w:color w:val="1B5E20"/>
           <w:sz w:val="28"/>
         </w:rPr>
         <w:t>3. Tests de performance — mission production</w:t>
@@ -448,12 +527,25 @@
     </w:p>
     <w:p>
       <w:pPr>
-        <w:pStyle w:val="Heading2"/>
+        <w:spacing w:after="120"/>
       </w:pPr>
       <w:r>
         <w:rPr>
-          <w:color w:val="2E74B5"/>
-          <w:sz w:val="24"/>
+          <w:color w:val="E65C00"/>
+          <w:sz w:val="18"/>
+        </w:rPr>
+        <w:t>────────────────────────────────────────────────────────────</w:t>
+      </w:r>
+    </w:p>
+    <w:p>
+      <w:pPr>
+        <w:spacing w:before="200"/>
+      </w:pPr>
+      <w:r>
+        <w:rPr>
+          <w:b/>
+          <w:color w:val="E65C00"/>
+          <w:sz w:val="22"/>
         </w:rPr>
         <w:t>3.1 Méthodologie</w:t>
       </w:r>
@@ -468,12 +560,13 @@
     </w:p>
     <w:p>
       <w:pPr>
-        <w:pStyle w:val="Heading2"/>
+        <w:spacing w:before="200"/>
       </w:pPr>
       <w:r>
         <w:rPr>
-          <w:color w:val="2E74B5"/>
-          <w:sz w:val="24"/>
+          <w:b/>
+          <w:color w:val="E65C00"/>
+          <w:sz w:val="22"/>
         </w:rPr>
         <w:t>3.2 Résultats des 10 questions</w:t>
       </w:r>
@@ -482,7 +575,7 @@
       <w:tblPr>
         <w:tblStyle w:val="TableGrid"/>
         <w:tblW w:type="auto" w:w="0"/>
-        <w:jc w:val="center"/>
+        <w:jc w:val="left"/>
         <w:tblLook w:firstColumn="1" w:firstRow="1" w:lastColumn="0" w:lastRow="0" w:noHBand="0" w:noVBand="1" w:val="04A0"/>
       </w:tblPr>
       <w:tblGrid>
@@ -495,7 +588,7 @@
         <w:tc>
           <w:tcPr>
             <w:tcW w:type="dxa" w:w="2351"/>
-            <w:shd w:val="clear" w:color="auto" w:fill="1F497D"/>
+            <w:shd w:val="clear" w:color="auto" w:fill="1B5E20"/>
           </w:tcPr>
           <w:p>
             <w:r>
@@ -511,7 +604,7 @@
         <w:tc>
           <w:tcPr>
             <w:tcW w:type="dxa" w:w="2351"/>
-            <w:shd w:val="clear" w:color="auto" w:fill="1F497D"/>
+            <w:shd w:val="clear" w:color="auto" w:fill="1B5E20"/>
           </w:tcPr>
           <w:p>
             <w:r>
@@ -527,7 +620,7 @@
         <w:tc>
           <w:tcPr>
             <w:tcW w:type="dxa" w:w="2351"/>
-            <w:shd w:val="clear" w:color="auto" w:fill="1F497D"/>
+            <w:shd w:val="clear" w:color="auto" w:fill="1B5E20"/>
           </w:tcPr>
           <w:p>
             <w:r>
@@ -543,7 +636,7 @@
         <w:tc>
           <w:tcPr>
             <w:tcW w:type="dxa" w:w="2351"/>
-            <w:shd w:val="clear" w:color="auto" w:fill="1F497D"/>
+            <w:shd w:val="clear" w:color="auto" w:fill="1B5E20"/>
           </w:tcPr>
           <w:p>
             <w:r>
@@ -561,7 +654,7 @@
         <w:tc>
           <w:tcPr>
             <w:tcW w:type="dxa" w:w="2351"/>
-            <w:shd w:val="clear" w:color="auto" w:fill="DEEAF1"/>
+            <w:shd w:val="clear" w:color="auto" w:fill="E8F5E9"/>
           </w:tcPr>
           <w:p>
             <w:r>
@@ -575,7 +668,7 @@
         <w:tc>
           <w:tcPr>
             <w:tcW w:type="dxa" w:w="2351"/>
-            <w:shd w:val="clear" w:color="auto" w:fill="DEEAF1"/>
+            <w:shd w:val="clear" w:color="auto" w:fill="E8F5E9"/>
           </w:tcPr>
           <w:p>
             <w:r>
@@ -589,7 +682,7 @@
         <w:tc>
           <w:tcPr>
             <w:tcW w:type="dxa" w:w="2351"/>
-            <w:shd w:val="clear" w:color="auto" w:fill="DEEAF1"/>
+            <w:shd w:val="clear" w:color="auto" w:fill="E8F5E9"/>
           </w:tcPr>
           <w:p>
             <w:r>
@@ -603,7 +696,7 @@
         <w:tc>
           <w:tcPr>
             <w:tcW w:type="dxa" w:w="2351"/>
-            <w:shd w:val="clear" w:color="auto" w:fill="DEEAF1"/>
+            <w:shd w:val="clear" w:color="auto" w:fill="E8F5E9"/>
           </w:tcPr>
           <w:p>
             <w:r>
@@ -677,7 +770,7 @@
         <w:tc>
           <w:tcPr>
             <w:tcW w:type="dxa" w:w="2351"/>
-            <w:shd w:val="clear" w:color="auto" w:fill="DEEAF1"/>
+            <w:shd w:val="clear" w:color="auto" w:fill="E8F5E9"/>
           </w:tcPr>
           <w:p>
             <w:r>
@@ -691,7 +784,7 @@
         <w:tc>
           <w:tcPr>
             <w:tcW w:type="dxa" w:w="2351"/>
-            <w:shd w:val="clear" w:color="auto" w:fill="DEEAF1"/>
+            <w:shd w:val="clear" w:color="auto" w:fill="E8F5E9"/>
           </w:tcPr>
           <w:p>
             <w:r>
@@ -705,7 +798,7 @@
         <w:tc>
           <w:tcPr>
             <w:tcW w:type="dxa" w:w="2351"/>
-            <w:shd w:val="clear" w:color="auto" w:fill="DEEAF1"/>
+            <w:shd w:val="clear" w:color="auto" w:fill="E8F5E9"/>
           </w:tcPr>
           <w:p>
             <w:r>
@@ -719,7 +812,7 @@
         <w:tc>
           <w:tcPr>
             <w:tcW w:type="dxa" w:w="2351"/>
-            <w:shd w:val="clear" w:color="auto" w:fill="DEEAF1"/>
+            <w:shd w:val="clear" w:color="auto" w:fill="E8F5E9"/>
           </w:tcPr>
           <w:p>
             <w:r>
@@ -793,7 +886,7 @@
         <w:tc>
           <w:tcPr>
             <w:tcW w:type="dxa" w:w="2351"/>
-            <w:shd w:val="clear" w:color="auto" w:fill="DEEAF1"/>
+            <w:shd w:val="clear" w:color="auto" w:fill="E8F5E9"/>
           </w:tcPr>
           <w:p>
             <w:r>
@@ -807,7 +900,7 @@
         <w:tc>
           <w:tcPr>
             <w:tcW w:type="dxa" w:w="2351"/>
-            <w:shd w:val="clear" w:color="auto" w:fill="DEEAF1"/>
+            <w:shd w:val="clear" w:color="auto" w:fill="E8F5E9"/>
           </w:tcPr>
           <w:p>
             <w:r>
@@ -821,7 +914,7 @@
         <w:tc>
           <w:tcPr>
             <w:tcW w:type="dxa" w:w="2351"/>
-            <w:shd w:val="clear" w:color="auto" w:fill="DEEAF1"/>
+            <w:shd w:val="clear" w:color="auto" w:fill="E8F5E9"/>
           </w:tcPr>
           <w:p>
             <w:r>
@@ -835,7 +928,7 @@
         <w:tc>
           <w:tcPr>
             <w:tcW w:type="dxa" w:w="2351"/>
-            <w:shd w:val="clear" w:color="auto" w:fill="DEEAF1"/>
+            <w:shd w:val="clear" w:color="auto" w:fill="E8F5E9"/>
           </w:tcPr>
           <w:p>
             <w:r>
@@ -909,7 +1002,7 @@
         <w:tc>
           <w:tcPr>
             <w:tcW w:type="dxa" w:w="2351"/>
-            <w:shd w:val="clear" w:color="auto" w:fill="DEEAF1"/>
+            <w:shd w:val="clear" w:color="auto" w:fill="E8F5E9"/>
           </w:tcPr>
           <w:p>
             <w:r>
@@ -923,7 +1016,7 @@
         <w:tc>
           <w:tcPr>
             <w:tcW w:type="dxa" w:w="2351"/>
-            <w:shd w:val="clear" w:color="auto" w:fill="DEEAF1"/>
+            <w:shd w:val="clear" w:color="auto" w:fill="E8F5E9"/>
           </w:tcPr>
           <w:p>
             <w:r>
@@ -937,7 +1030,7 @@
         <w:tc>
           <w:tcPr>
             <w:tcW w:type="dxa" w:w="2351"/>
-            <w:shd w:val="clear" w:color="auto" w:fill="DEEAF1"/>
+            <w:shd w:val="clear" w:color="auto" w:fill="E8F5E9"/>
           </w:tcPr>
           <w:p>
             <w:r>
@@ -951,7 +1044,7 @@
         <w:tc>
           <w:tcPr>
             <w:tcW w:type="dxa" w:w="2351"/>
-            <w:shd w:val="clear" w:color="auto" w:fill="DEEAF1"/>
+            <w:shd w:val="clear" w:color="auto" w:fill="E8F5E9"/>
           </w:tcPr>
           <w:p>
             <w:r>
@@ -1025,7 +1118,7 @@
         <w:tc>
           <w:tcPr>
             <w:tcW w:type="dxa" w:w="2351"/>
-            <w:shd w:val="clear" w:color="auto" w:fill="DEEAF1"/>
+            <w:shd w:val="clear" w:color="auto" w:fill="E8F5E9"/>
           </w:tcPr>
           <w:p>
             <w:r>
@@ -1039,7 +1132,7 @@
         <w:tc>
           <w:tcPr>
             <w:tcW w:type="dxa" w:w="2351"/>
-            <w:shd w:val="clear" w:color="auto" w:fill="DEEAF1"/>
+            <w:shd w:val="clear" w:color="auto" w:fill="E8F5E9"/>
           </w:tcPr>
           <w:p>
             <w:r>
@@ -1053,7 +1146,7 @@
         <w:tc>
           <w:tcPr>
             <w:tcW w:type="dxa" w:w="2351"/>
-            <w:shd w:val="clear" w:color="auto" w:fill="DEEAF1"/>
+            <w:shd w:val="clear" w:color="auto" w:fill="E8F5E9"/>
           </w:tcPr>
           <w:p>
             <w:r>
@@ -1067,7 +1160,7 @@
         <w:tc>
           <w:tcPr>
             <w:tcW w:type="dxa" w:w="2351"/>
-            <w:shd w:val="clear" w:color="auto" w:fill="DEEAF1"/>
+            <w:shd w:val="clear" w:color="auto" w:fill="E8F5E9"/>
           </w:tcPr>
           <w:p>
             <w:r>
@@ -1141,12 +1234,13 @@
     <w:p/>
     <w:p>
       <w:pPr>
-        <w:pStyle w:val="Heading2"/>
+        <w:spacing w:before="200"/>
       </w:pPr>
       <w:r>
         <w:rPr>
-          <w:color w:val="2E74B5"/>
-          <w:sz w:val="24"/>
+          <w:b/>
+          <w:color w:val="E65C00"/>
+          <w:sz w:val="22"/>
         </w:rPr>
         <w:t>3.3 Synthèse des tests</w:t>
       </w:r>
@@ -1155,7 +1249,7 @@
       <w:tblPr>
         <w:tblStyle w:val="TableGrid"/>
         <w:tblW w:type="auto" w:w="0"/>
-        <w:jc w:val="center"/>
+        <w:jc w:val="left"/>
         <w:tblLook w:firstColumn="1" w:firstRow="1" w:lastColumn="0" w:lastRow="0" w:noHBand="0" w:noVBand="1" w:val="04A0"/>
       </w:tblPr>
       <w:tblGrid>
@@ -1166,7 +1260,7 @@
         <w:tc>
           <w:tcPr>
             <w:tcW w:type="dxa" w:w="4703"/>
-            <w:shd w:val="clear" w:color="auto" w:fill="1F497D"/>
+            <w:shd w:val="clear" w:color="auto" w:fill="1B5E20"/>
           </w:tcPr>
           <w:p>
             <w:r>
@@ -1182,7 +1276,7 @@
         <w:tc>
           <w:tcPr>
             <w:tcW w:type="dxa" w:w="4703"/>
-            <w:shd w:val="clear" w:color="auto" w:fill="1F497D"/>
+            <w:shd w:val="clear" w:color="auto" w:fill="1B5E20"/>
           </w:tcPr>
           <w:p>
             <w:r>
@@ -1200,7 +1294,7 @@
         <w:tc>
           <w:tcPr>
             <w:tcW w:type="dxa" w:w="4703"/>
-            <w:shd w:val="clear" w:color="auto" w:fill="DEEAF1"/>
+            <w:shd w:val="clear" w:color="auto" w:fill="E8F5E9"/>
           </w:tcPr>
           <w:p>
             <w:r>
@@ -1214,7 +1308,7 @@
         <w:tc>
           <w:tcPr>
             <w:tcW w:type="dxa" w:w="4703"/>
-            <w:shd w:val="clear" w:color="auto" w:fill="DEEAF1"/>
+            <w:shd w:val="clear" w:color="auto" w:fill="E8F5E9"/>
           </w:tcPr>
           <w:p>
             <w:r>
@@ -1260,7 +1354,7 @@
         <w:tc>
           <w:tcPr>
             <w:tcW w:type="dxa" w:w="4703"/>
-            <w:shd w:val="clear" w:color="auto" w:fill="DEEAF1"/>
+            <w:shd w:val="clear" w:color="auto" w:fill="E8F5E9"/>
           </w:tcPr>
           <w:p>
             <w:r>
@@ -1274,7 +1368,7 @@
         <w:tc>
           <w:tcPr>
             <w:tcW w:type="dxa" w:w="4703"/>
-            <w:shd w:val="clear" w:color="auto" w:fill="DEEAF1"/>
+            <w:shd w:val="clear" w:color="auto" w:fill="E8F5E9"/>
           </w:tcPr>
           <w:p>
             <w:r>
@@ -1320,7 +1414,7 @@
         <w:tc>
           <w:tcPr>
             <w:tcW w:type="dxa" w:w="4703"/>
-            <w:shd w:val="clear" w:color="auto" w:fill="DEEAF1"/>
+            <w:shd w:val="clear" w:color="auto" w:fill="E8F5E9"/>
           </w:tcPr>
           <w:p>
             <w:r>
@@ -1334,7 +1428,7 @@
         <w:tc>
           <w:tcPr>
             <w:tcW w:type="dxa" w:w="4703"/>
-            <w:shd w:val="clear" w:color="auto" w:fill="DEEAF1"/>
+            <w:shd w:val="clear" w:color="auto" w:fill="E8F5E9"/>
           </w:tcPr>
           <w:p>
             <w:r>
@@ -1416,14 +1510,27 @@
     <w:p/>
     <w:p>
       <w:pPr>
-        <w:pStyle w:val="Heading1"/>
+        <w:spacing w:before="320" w:after="40"/>
       </w:pPr>
       <w:r>
         <w:rPr>
-          <w:color w:val="1F497D"/>
+          <w:b/>
+          <w:color w:val="1B5E20"/>
           <w:sz w:val="28"/>
         </w:rPr>
         <w:t>4. Observation sur le modèle</w:t>
+      </w:r>
+    </w:p>
+    <w:p>
+      <w:pPr>
+        <w:spacing w:after="120"/>
+      </w:pPr>
+      <w:r>
+        <w:rPr>
+          <w:color w:val="E65C00"/>
+          <w:sz w:val="18"/>
+        </w:rPr>
+        <w:t>────────────────────────────────────────────────────────────</w:t>
       </w:r>
     </w:p>
     <w:tbl>
@@ -1439,15 +1546,16 @@
         <w:tc>
           <w:tcPr>
             <w:tcW w:type="dxa" w:w="9406"/>
-            <w:shd w:val="clear" w:color="auto" w:fill="FFF2CC"/>
+            <w:shd w:val="clear" w:color="auto" w:fill="FBE9E7"/>
           </w:tcPr>
           <w:p>
             <w:r>
               <w:rPr>
                 <w:b/>
-                <w:color w:val="C00000"/>
+                <w:color w:val="E65C00"/>
+                <w:sz w:val="22"/>
               </w:rPr>
-              <w:t>Point d'attention — Langue des réponses</w:t>
+              <w:t>⚠  Point d'attention — Langue des réponses</w:t>
               <w:br/>
             </w:r>
             <w:r>
@@ -1463,11 +1571,12 @@
     <w:p/>
     <w:p>
       <w:pPr>
-        <w:pStyle w:val="Heading1"/>
+        <w:spacing w:before="320" w:after="40"/>
       </w:pPr>
       <w:r>
         <w:rPr>
-          <w:color w:val="1F497D"/>
+          <w:b/>
+          <w:color w:val="1B5E20"/>
           <w:sz w:val="28"/>
         </w:rPr>
         <w:t>5. Fine-tuning médical expérimental — Google Colab</w:t>
@@ -1475,12 +1584,25 @@
     </w:p>
     <w:p>
       <w:pPr>
-        <w:pStyle w:val="Heading2"/>
+        <w:spacing w:after="120"/>
       </w:pPr>
       <w:r>
         <w:rPr>
-          <w:color w:val="2E74B5"/>
-          <w:sz w:val="24"/>
+          <w:color w:val="E65C00"/>
+          <w:sz w:val="18"/>
+        </w:rPr>
+        <w:t>────────────────────────────────────────────────────────────</w:t>
+      </w:r>
+    </w:p>
+    <w:p>
+      <w:pPr>
+        <w:spacing w:before="200"/>
+      </w:pPr>
+      <w:r>
+        <w:rPr>
+          <w:b/>
+          <w:color w:val="E65C00"/>
+          <w:sz w:val="22"/>
         </w:rPr>
         <w:t>5.1 Objectif</w:t>
       </w:r>
@@ -1495,12 +1617,13 @@
     </w:p>
     <w:p>
       <w:pPr>
-        <w:pStyle w:val="Heading2"/>
+        <w:spacing w:before="200"/>
       </w:pPr>
       <w:r>
         <w:rPr>
-          <w:color w:val="2E74B5"/>
-          <w:sz w:val="24"/>
+          <w:b/>
+          <w:color w:val="E65C00"/>
+          <w:sz w:val="22"/>
         </w:rPr>
         <w:t>5.2 Configuration d'entraînement</w:t>
       </w:r>
@@ -1509,7 +1632,7 @@
       <w:tblPr>
         <w:tblStyle w:val="TableGrid"/>
         <w:tblW w:type="auto" w:w="0"/>
-        <w:jc w:val="center"/>
+        <w:jc w:val="left"/>
         <w:tblLook w:firstColumn="1" w:firstRow="1" w:lastColumn="0" w:lastRow="0" w:noHBand="0" w:noVBand="1" w:val="04A0"/>
       </w:tblPr>
       <w:tblGrid>
@@ -1520,7 +1643,7 @@
         <w:tc>
           <w:tcPr>
             <w:tcW w:type="dxa" w:w="4703"/>
-            <w:shd w:val="clear" w:color="auto" w:fill="1F497D"/>
+            <w:shd w:val="clear" w:color="auto" w:fill="1B5E20"/>
           </w:tcPr>
           <w:p>
             <w:r>
@@ -1536,7 +1659,7 @@
         <w:tc>
           <w:tcPr>
             <w:tcW w:type="dxa" w:w="4703"/>
-            <w:shd w:val="clear" w:color="auto" w:fill="1F497D"/>
+            <w:shd w:val="clear" w:color="auto" w:fill="1B5E20"/>
           </w:tcPr>
           <w:p>
             <w:r>
@@ -1554,7 +1677,7 @@
         <w:tc>
           <w:tcPr>
             <w:tcW w:type="dxa" w:w="4703"/>
-            <w:shd w:val="clear" w:color="auto" w:fill="DEEAF1"/>
+            <w:shd w:val="clear" w:color="auto" w:fill="E8F5E9"/>
           </w:tcPr>
           <w:p>
             <w:r>
@@ -1568,7 +1691,7 @@
         <w:tc>
           <w:tcPr>
             <w:tcW w:type="dxa" w:w="4703"/>
-            <w:shd w:val="clear" w:color="auto" w:fill="DEEAF1"/>
+            <w:shd w:val="clear" w:color="auto" w:fill="E8F5E9"/>
           </w:tcPr>
           <w:p>
             <w:r>
@@ -1614,7 +1737,7 @@
         <w:tc>
           <w:tcPr>
             <w:tcW w:type="dxa" w:w="4703"/>
-            <w:shd w:val="clear" w:color="auto" w:fill="DEEAF1"/>
+            <w:shd w:val="clear" w:color="auto" w:fill="E8F5E9"/>
           </w:tcPr>
           <w:p>
             <w:r>
@@ -1628,7 +1751,7 @@
         <w:tc>
           <w:tcPr>
             <w:tcW w:type="dxa" w:w="4703"/>
-            <w:shd w:val="clear" w:color="auto" w:fill="DEEAF1"/>
+            <w:shd w:val="clear" w:color="auto" w:fill="E8F5E9"/>
           </w:tcPr>
           <w:p>
             <w:r>
@@ -1674,7 +1797,7 @@
         <w:tc>
           <w:tcPr>
             <w:tcW w:type="dxa" w:w="4703"/>
-            <w:shd w:val="clear" w:color="auto" w:fill="DEEAF1"/>
+            <w:shd w:val="clear" w:color="auto" w:fill="E8F5E9"/>
           </w:tcPr>
           <w:p>
             <w:r>
@@ -1688,7 +1811,7 @@
         <w:tc>
           <w:tcPr>
             <w:tcW w:type="dxa" w:w="4703"/>
-            <w:shd w:val="clear" w:color="auto" w:fill="DEEAF1"/>
+            <w:shd w:val="clear" w:color="auto" w:fill="E8F5E9"/>
           </w:tcPr>
           <w:p>
             <w:r>
@@ -1734,7 +1857,7 @@
         <w:tc>
           <w:tcPr>
             <w:tcW w:type="dxa" w:w="4703"/>
-            <w:shd w:val="clear" w:color="auto" w:fill="DEEAF1"/>
+            <w:shd w:val="clear" w:color="auto" w:fill="E8F5E9"/>
           </w:tcPr>
           <w:p>
             <w:r>
@@ -1748,7 +1871,7 @@
         <w:tc>
           <w:tcPr>
             <w:tcW w:type="dxa" w:w="4703"/>
-            <w:shd w:val="clear" w:color="auto" w:fill="DEEAF1"/>
+            <w:shd w:val="clear" w:color="auto" w:fill="E8F5E9"/>
           </w:tcPr>
           <w:p>
             <w:r>
@@ -1794,12 +1917,13 @@
     <w:p/>
     <w:p>
       <w:pPr>
-        <w:pStyle w:val="Heading2"/>
+        <w:spacing w:before="200"/>
       </w:pPr>
       <w:r>
         <w:rPr>
-          <w:color w:val="2E74B5"/>
-          <w:sz w:val="24"/>
+          <w:b/>
+          <w:color w:val="E65C00"/>
+          <w:sz w:val="22"/>
         </w:rPr>
         <w:t>5.3 Métriques d'entraînement</w:t>
       </w:r>
@@ -1882,21 +2006,34 @@
     <w:p/>
     <w:p>
       <w:pPr>
-        <w:pStyle w:val="Heading1"/>
+        <w:spacing w:before="320" w:after="40"/>
       </w:pPr>
       <w:r>
         <w:rPr>
-          <w:color w:val="1F497D"/>
+          <w:b/>
+          <w:color w:val="1B5E20"/>
           <w:sz w:val="28"/>
         </w:rPr>
         <w:t>6. Synthèse</w:t>
+      </w:r>
+    </w:p>
+    <w:p>
+      <w:pPr>
+        <w:spacing w:after="120"/>
+      </w:pPr>
+      <w:r>
+        <w:rPr>
+          <w:color w:val="E65C00"/>
+          <w:sz w:val="18"/>
+        </w:rPr>
+        <w:t>────────────────────────────────────────────────────────────</w:t>
       </w:r>
     </w:p>
     <w:tbl>
       <w:tblPr>
         <w:tblStyle w:val="TableGrid"/>
         <w:tblW w:type="auto" w:w="0"/>
-        <w:jc w:val="center"/>
+        <w:jc w:val="left"/>
         <w:tblLook w:firstColumn="1" w:firstRow="1" w:lastColumn="0" w:lastRow="0" w:noHBand="0" w:noVBand="1" w:val="04A0"/>
       </w:tblPr>
       <w:tblGrid>
@@ -1907,7 +2044,7 @@
         <w:tc>
           <w:tcPr>
             <w:tcW w:type="dxa" w:w="4703"/>
-            <w:shd w:val="clear" w:color="auto" w:fill="1F497D"/>
+            <w:shd w:val="clear" w:color="auto" w:fill="1B5E20"/>
           </w:tcPr>
           <w:p>
             <w:r>
@@ -1923,7 +2060,7 @@
         <w:tc>
           <w:tcPr>
             <w:tcW w:type="dxa" w:w="4703"/>
-            <w:shd w:val="clear" w:color="auto" w:fill="1F497D"/>
+            <w:shd w:val="clear" w:color="auto" w:fill="1B5E20"/>
           </w:tcPr>
           <w:p>
             <w:r>
@@ -1941,7 +2078,7 @@
         <w:tc>
           <w:tcPr>
             <w:tcW w:type="dxa" w:w="4703"/>
-            <w:shd w:val="clear" w:color="auto" w:fill="DEEAF1"/>
+            <w:shd w:val="clear" w:color="auto" w:fill="E8F5E9"/>
           </w:tcPr>
           <w:p>
             <w:r>
@@ -1955,7 +2092,7 @@
         <w:tc>
           <w:tcPr>
             <w:tcW w:type="dxa" w:w="4703"/>
-            <w:shd w:val="clear" w:color="auto" w:fill="DEEAF1"/>
+            <w:shd w:val="clear" w:color="auto" w:fill="E8F5E9"/>
           </w:tcPr>
           <w:p>
             <w:r>
@@ -2001,7 +2138,7 @@
         <w:tc>
           <w:tcPr>
             <w:tcW w:type="dxa" w:w="4703"/>
-            <w:shd w:val="clear" w:color="auto" w:fill="DEEAF1"/>
+            <w:shd w:val="clear" w:color="auto" w:fill="E8F5E9"/>
           </w:tcPr>
           <w:p>
             <w:r>
@@ -2015,7 +2152,7 @@
         <w:tc>
           <w:tcPr>
             <w:tcW w:type="dxa" w:w="4703"/>
-            <w:shd w:val="clear" w:color="auto" w:fill="DEEAF1"/>
+            <w:shd w:val="clear" w:color="auto" w:fill="E8F5E9"/>
           </w:tcPr>
           <w:p>
             <w:r>
@@ -2061,7 +2198,7 @@
         <w:tc>
           <w:tcPr>
             <w:tcW w:type="dxa" w:w="4703"/>
-            <w:shd w:val="clear" w:color="auto" w:fill="DEEAF1"/>
+            <w:shd w:val="clear" w:color="auto" w:fill="E8F5E9"/>
           </w:tcPr>
           <w:p>
             <w:r>
@@ -2075,7 +2212,7 @@
         <w:tc>
           <w:tcPr>
             <w:tcW w:type="dxa" w:w="4703"/>
-            <w:shd w:val="clear" w:color="auto" w:fill="DEEAF1"/>
+            <w:shd w:val="clear" w:color="auto" w:fill="E8F5E9"/>
           </w:tcPr>
           <w:p>
             <w:r>

</xml_diff>